<commit_message>
chores: update design decision document
</commit_message>
<xml_diff>
--- a/Design Decisions.docx
+++ b/Design Decisions.docx
@@ -173,6 +173,13 @@
         </w:rPr>
         <w:t>. Finally, users can dynamically toggle the camera's projection matrix between orthographic and perspective views by pressing the O and P keys.</w:t>
       </w:r>
+      <w:r>
+        <w:rPr>
+          <w:rFonts w:ascii="Times New Roman" w:hAnsi="Times New Roman" w:cs="Times New Roman"/>
+          <w:lang w:val="en-US"/>
+        </w:rPr>
+        <w:t xml:space="preserve"> These hardware inputs are intercepted and processed by using GLFW callbacks routed through the `ViewManager::ProcessKeyboardEvents()` and `ViewManager::Mouse_Position_Callback()` methods, which then update the Camera class’s transformation matrices.</w:t>
+      </w:r>
     </w:p>
     <w:p>
       <w:pPr>
@@ -269,6 +276,7 @@
           <w:rFonts w:ascii="Times New Roman" w:hAnsi="Times New Roman" w:cs="Times New Roman"/>
           <w:lang w:val="en-US"/>
         </w:rPr>
+        <w:lastRenderedPageBreak/>
         <w:t>Furthermore, I created a custom Texture structure to apply image assets safely. Instead of relying on raw string literals</w:t>
       </w:r>
       <w:r>
@@ -297,15 +305,7 @@
           <w:rFonts w:ascii="Times New Roman" w:hAnsi="Times New Roman" w:cs="Times New Roman"/>
           <w:lang w:val="en-US"/>
         </w:rPr>
-        <w:t xml:space="preserve">the system uses a strongly typed C++ enum. These structural divisions completely separate the creation logic </w:t>
-      </w:r>
-      <w:r>
-        <w:rPr>
-          <w:rFonts w:ascii="Times New Roman" w:hAnsi="Times New Roman" w:cs="Times New Roman"/>
-          <w:lang w:val="en-US"/>
-        </w:rPr>
-        <w:lastRenderedPageBreak/>
-        <w:t>from the rendering logic. The main RenderScene() function is now exclusively concerned with iterating through a vector of predefined meshes and executing draw calls, resulting in a clean, reusable architecture that easily scales to future projects.</w:t>
+        <w:t>the system uses a strongly typed C++ enum. These structural divisions completely separate the creation logic from the rendering logic. The main RenderScene() function is now exclusively concerned with iterating through a vector of predefined meshes and executing draw calls, resulting in a clean, reusable architecture that easily scales to future projects.</w:t>
       </w:r>
     </w:p>
     <w:sectPr>

</xml_diff>